<commit_message>
Asignamos la carpeta de componentes
</commit_message>
<xml_diff>
--- a/Studio Catito Ideas.docx
+++ b/Studio Catito Ideas.docx
@@ -82,7 +82,7 @@
     <w:p>
       <w:r>
         <w:pict w14:anchorId="2859BAAC">
-          <v:rect id="_x0000_i1037" style="width:0;height:1.5pt" o:hralign="center" o:hrstd="t" o:hr="t" fillcolor="#a0a0a0" stroked="f"/>
+          <v:rect id="_x0000_i1025" style="width:0;height:1.5pt" o:hralign="center" o:hrstd="t" o:hr="t" fillcolor="#a0a0a0" stroked="f"/>
         </w:pict>
       </w:r>
     </w:p>
@@ -114,7 +114,7 @@
     <w:p>
       <w:r>
         <w:pict w14:anchorId="155B2956">
-          <v:rect id="_x0000_i1038" style="width:0;height:1.5pt" o:hralign="center" o:hrstd="t" o:hr="t" fillcolor="#a0a0a0" stroked="f"/>
+          <v:rect id="_x0000_i1026" style="width:0;height:1.5pt" o:hralign="center" o:hrstd="t" o:hr="t" fillcolor="#a0a0a0" stroked="f"/>
         </w:pict>
       </w:r>
     </w:p>
@@ -516,7 +516,7 @@
     <w:p>
       <w:r>
         <w:pict w14:anchorId="22B4BBCA">
-          <v:rect id="_x0000_i1047" style="width:0;height:1.5pt" o:hralign="center" o:hrstd="t" o:hr="t" fillcolor="#a0a0a0" stroked="f"/>
+          <v:rect id="_x0000_i1027" style="width:0;height:1.5pt" o:hralign="center" o:hrstd="t" o:hr="t" fillcolor="#a0a0a0" stroked="f"/>
         </w:pict>
       </w:r>
     </w:p>
@@ -746,7 +746,7 @@
     <w:p>
       <w:r>
         <w:pict w14:anchorId="124F0E93">
-          <v:rect id="_x0000_i1061" style="width:0;height:1.5pt" o:hralign="center" o:hrstd="t" o:hr="t" fillcolor="#a0a0a0" stroked="f"/>
+          <v:rect id="_x0000_i1028" style="width:0;height:1.5pt" o:hralign="center" o:hrstd="t" o:hr="t" fillcolor="#a0a0a0" stroked="f"/>
         </w:pict>
       </w:r>
     </w:p>
@@ -924,7 +924,7 @@
     <w:p>
       <w:r>
         <w:pict w14:anchorId="7DEEC782">
-          <v:rect id="_x0000_i1062" style="width:0;height:1.5pt" o:hralign="center" o:hrstd="t" o:hr="t" fillcolor="#a0a0a0" stroked="f"/>
+          <v:rect id="_x0000_i1029" style="width:0;height:1.5pt" o:hralign="center" o:hrstd="t" o:hr="t" fillcolor="#a0a0a0" stroked="f"/>
         </w:pict>
       </w:r>
     </w:p>
@@ -1350,6 +1350,141 @@
         <w:t>Creo que este proyecto merece planearse bien desde el inicio. Podemos diseñarlo como una marca que siga siendo relevante dentro de cinco o diez años, en lugar de solo crear una página web para mostrar tus aplicaciones.</w:t>
       </w:r>
     </w:p>
+    <w:p/>
+    <w:p>
+      <w:pPr>
+        <w:rPr>
+          <w:b/>
+          <w:bCs/>
+        </w:rPr>
+      </w:pPr>
+      <w:r>
+        <w:rPr>
+          <w:b/>
+          <w:bCs/>
+        </w:rPr>
+        <w:t>Mi propuesta para hoy</w:t>
+      </w:r>
+    </w:p>
+    <w:p>
+      <w:r>
+        <w:t xml:space="preserve">En lugar de seguir agregando todo dentro de </w:t>
+      </w:r>
+      <w:proofErr w:type="spellStart"/>
+      <w:r>
+        <w:t>App.tsx</w:t>
+      </w:r>
+      <w:proofErr w:type="spellEnd"/>
+      <w:r>
+        <w:t>, demos el primer paso como un estudio profesional.</w:t>
+      </w:r>
+    </w:p>
+    <w:p>
+      <w:pPr>
+        <w:rPr>
+          <w:b/>
+          <w:bCs/>
+        </w:rPr>
+      </w:pPr>
+      <w:r>
+        <w:rPr>
+          <w:b/>
+          <w:bCs/>
+        </w:rPr>
+        <w:t>Paso 1 (20 minutos)</w:t>
+      </w:r>
+    </w:p>
+    <w:p>
+      <w:r>
+        <w:t xml:space="preserve">Crear el componente </w:t>
+      </w:r>
+      <w:proofErr w:type="spellStart"/>
+      <w:r>
+        <w:rPr>
+          <w:b/>
+          <w:bCs/>
+        </w:rPr>
+        <w:t>Navbar</w:t>
+      </w:r>
+      <w:proofErr w:type="spellEnd"/>
+      <w:r>
+        <w:t>.</w:t>
+      </w:r>
+    </w:p>
+    <w:p>
+      <w:pPr>
+        <w:rPr>
+          <w:b/>
+          <w:bCs/>
+        </w:rPr>
+      </w:pPr>
+      <w:r>
+        <w:rPr>
+          <w:b/>
+          <w:bCs/>
+        </w:rPr>
+        <w:t>Paso 2 (30 minutos)</w:t>
+      </w:r>
+    </w:p>
+    <w:p>
+      <w:r>
+        <w:t xml:space="preserve">Crear el componente </w:t>
+      </w:r>
+      <w:r>
+        <w:rPr>
+          <w:b/>
+          <w:bCs/>
+        </w:rPr>
+        <w:t>Hero</w:t>
+      </w:r>
+      <w:r>
+        <w:t>.</w:t>
+      </w:r>
+    </w:p>
+    <w:p>
+      <w:pPr>
+        <w:rPr>
+          <w:b/>
+          <w:bCs/>
+        </w:rPr>
+      </w:pPr>
+      <w:r>
+        <w:rPr>
+          <w:b/>
+          <w:bCs/>
+        </w:rPr>
+        <w:t>Paso 3 (40 minutos)</w:t>
+      </w:r>
+    </w:p>
+    <w:p>
+      <w:r>
+        <w:t>Agregar el fondo con la imagen.</w:t>
+      </w:r>
+    </w:p>
+    <w:p>
+      <w:pPr>
+        <w:rPr>
+          <w:b/>
+          <w:bCs/>
+        </w:rPr>
+      </w:pPr>
+      <w:r>
+        <w:rPr>
+          <w:b/>
+          <w:bCs/>
+        </w:rPr>
+        <w:t>Paso 4</w:t>
+      </w:r>
+    </w:p>
+    <w:p>
+      <w:r>
+        <w:t>Agregar efectos.</w:t>
+      </w:r>
+    </w:p>
+    <w:p/>
+    <w:p/>
+    <w:p/>
+    <w:p/>
     <w:p/>
     <w:sectPr>
       <w:type w:val="continuous"/>

</xml_diff>